<commit_message>
feat(examples): an integration guide example, and the invoice and transcript move to US Letter
The new guide example is three US Letter pages, portrait, landscape and
portrait, with highlighted curl, JSON and PHP code blocks, an endpoint
table with method badges, a callout, a key-value card, a QR code and a
go-live checklist. It is written in PHP and Blade, with HTML and Word
goldens.

The invoice and transcript now use US Letter and inches, so the examples
show both conventions; the report and form responses stay on A4. The
transcript runs to three pages. Their HTML, Word and PDF goldens changed
for page size and column widths only.

The examples gallery shows the guide on its own row, with its landscape
page drawn wider.

Co-Authored-By: Claude Opus 5.5 <noreply@anthropic.com>
</commit_message>
<xml_diff>
--- a/site/src/.vuepress/public/examples/invoice.docx
+++ b/site/src/.vuepress/public/examples/invoice.docx
@@ -4,7 +4,7 @@
   <w:body>
     <w:tbl>
       <w:tblPr>
-        <w:tblW w:w="9638" w:type="dxa"/>
+        <w:tblW w:w="10080" w:type="dxa"/>
         <w:tblBorders>
           <w:top w:val="none" w:sz="0" w:space="0" w:color="auto"/>
           <w:left w:val="none" w:sz="0" w:space="0" w:color="auto"/>
@@ -21,7 +21,7 @@
       </w:tblPr>
       <w:tblGrid>
         <w:gridCol w:w="3231"/>
-        <w:gridCol w:w="2169"/>
+        <w:gridCol w:w="2611"/>
         <w:gridCol w:w="4238"/>
       </w:tblGrid>
       <w:tr>
@@ -106,7 +106,7 @@
         </w:tc>
         <w:tc>
           <w:tcPr>
-            <w:tcW w:w="2169" w:type="dxa"/>
+            <w:tcW w:w="2611" w:type="dxa"/>
             <w:tcMar>
               <w:top w:w="0" w:type="dxa"/>
               <w:left w:w="0" w:type="dxa"/>
@@ -210,7 +210,7 @@
     </w:p>
     <w:tbl>
       <w:tblPr>
-        <w:tblW w:w="9638" w:type="dxa"/>
+        <w:tblW w:w="10080" w:type="dxa"/>
         <w:tblBorders>
           <w:top w:val="none" w:sz="0" w:space="0" w:color="auto"/>
           <w:left w:val="none" w:sz="0" w:space="0" w:color="auto"/>
@@ -228,14 +228,14 @@
         </w:tblCellMar>
       </w:tblPr>
       <w:tblGrid>
-        <w:gridCol w:w="4888"/>
+        <w:gridCol w:w="5109"/>
         <w:gridCol w:w="320"/>
-        <w:gridCol w:w="4430"/>
+        <w:gridCol w:w="4651"/>
       </w:tblGrid>
       <w:tr>
         <w:tc>
           <w:tcPr>
-            <w:tcW w:w="4888" w:type="dxa"/>
+            <w:tcW w:w="5109" w:type="dxa"/>
             <w:shd w:val="clear" w:color="auto" w:fill="f8fafc"/>
             <w:tcMar>
               <w:top w:w="240" w:type="dxa"/>
@@ -351,7 +351,7 @@
         </w:tc>
         <w:tc>
           <w:tcPr>
-            <w:tcW w:w="4430" w:type="dxa"/>
+            <w:tcW w:w="4651" w:type="dxa"/>
             <w:shd w:val="clear" w:color="auto" w:fill="f8fafc"/>
             <w:tcMar>
               <w:top w:w="240" w:type="dxa"/>
@@ -443,7 +443,7 @@
     </w:p>
     <w:tbl>
       <w:tblPr>
-        <w:tblW w:w="9638" w:type="dxa"/>
+        <w:tblW w:w="10080" w:type="dxa"/>
         <w:tblBorders>
           <w:top w:val="none" w:sz="0" w:space="0" w:color="auto"/>
           <w:left w:val="none" w:sz="0" w:space="0" w:color="auto"/>
@@ -461,10 +461,10 @@
         </w:tblCellMar>
       </w:tblPr>
       <w:tblGrid>
-        <w:gridCol w:w="5669"/>
-        <w:gridCol w:w="1134"/>
-        <w:gridCol w:w="1417"/>
-        <w:gridCol w:w="1417"/>
+        <w:gridCol w:w="6048"/>
+        <w:gridCol w:w="1152"/>
+        <w:gridCol w:w="1440"/>
+        <w:gridCol w:w="1440"/>
       </w:tblGrid>
       <w:tr>
         <w:trPr>
@@ -473,7 +473,7 @@
         </w:trPr>
         <w:tc>
           <w:tcPr>
-            <w:tcW w:w="5669" w:type="dxa"/>
+            <w:tcW w:w="6048" w:type="dxa"/>
             <w:shd w:val="clear" w:color="auto" w:fill="f1f5f9"/>
             <w:tcMar>
               <w:top w:w="80" w:type="dxa"/>
@@ -502,7 +502,7 @@
         </w:tc>
         <w:tc>
           <w:tcPr>
-            <w:tcW w:w="1134" w:type="dxa"/>
+            <w:tcW w:w="1152" w:type="dxa"/>
             <w:shd w:val="clear" w:color="auto" w:fill="f1f5f9"/>
             <w:tcMar>
               <w:top w:w="80" w:type="dxa"/>
@@ -532,7 +532,7 @@
         </w:tc>
         <w:tc>
           <w:tcPr>
-            <w:tcW w:w="1417" w:type="dxa"/>
+            <w:tcW w:w="1440" w:type="dxa"/>
             <w:shd w:val="clear" w:color="auto" w:fill="f1f5f9"/>
             <w:tcMar>
               <w:top w:w="80" w:type="dxa"/>
@@ -562,7 +562,7 @@
         </w:tc>
         <w:tc>
           <w:tcPr>
-            <w:tcW w:w="1417" w:type="dxa"/>
+            <w:tcW w:w="1440" w:type="dxa"/>
             <w:shd w:val="clear" w:color="auto" w:fill="f1f5f9"/>
             <w:tcMar>
               <w:top w:w="80" w:type="dxa"/>
@@ -597,7 +597,7 @@
         </w:trPr>
         <w:tc>
           <w:tcPr>
-            <w:tcW w:w="5669" w:type="dxa"/>
+            <w:tcW w:w="6048" w:type="dxa"/>
             <w:tcBorders>
               <w:top w:val="none" w:sz="0" w:space="0" w:color="auto"/>
               <w:left w:val="none" w:sz="0" w:space="0" w:color="auto"/>
@@ -646,7 +646,7 @@
         </w:tc>
         <w:tc>
           <w:tcPr>
-            <w:tcW w:w="1134" w:type="dxa"/>
+            <w:tcW w:w="1152" w:type="dxa"/>
             <w:tcBorders>
               <w:top w:val="none" w:sz="0" w:space="0" w:color="auto"/>
               <w:left w:val="none" w:sz="0" w:space="0" w:color="auto"/>
@@ -679,7 +679,7 @@
         </w:tc>
         <w:tc>
           <w:tcPr>
-            <w:tcW w:w="1417" w:type="dxa"/>
+            <w:tcW w:w="1440" w:type="dxa"/>
             <w:tcBorders>
               <w:top w:val="none" w:sz="0" w:space="0" w:color="auto"/>
               <w:left w:val="none" w:sz="0" w:space="0" w:color="auto"/>
@@ -712,7 +712,7 @@
         </w:tc>
         <w:tc>
           <w:tcPr>
-            <w:tcW w:w="1417" w:type="dxa"/>
+            <w:tcW w:w="1440" w:type="dxa"/>
             <w:tcBorders>
               <w:top w:val="none" w:sz="0" w:space="0" w:color="auto"/>
               <w:left w:val="none" w:sz="0" w:space="0" w:color="auto"/>
@@ -750,7 +750,7 @@
         </w:trPr>
         <w:tc>
           <w:tcPr>
-            <w:tcW w:w="5669" w:type="dxa"/>
+            <w:tcW w:w="6048" w:type="dxa"/>
             <w:tcBorders>
               <w:top w:val="none" w:sz="0" w:space="0" w:color="auto"/>
               <w:left w:val="none" w:sz="0" w:space="0" w:color="auto"/>
@@ -799,7 +799,7 @@
         </w:tc>
         <w:tc>
           <w:tcPr>
-            <w:tcW w:w="1134" w:type="dxa"/>
+            <w:tcW w:w="1152" w:type="dxa"/>
             <w:tcBorders>
               <w:top w:val="none" w:sz="0" w:space="0" w:color="auto"/>
               <w:left w:val="none" w:sz="0" w:space="0" w:color="auto"/>
@@ -832,7 +832,7 @@
         </w:tc>
         <w:tc>
           <w:tcPr>
-            <w:tcW w:w="1417" w:type="dxa"/>
+            <w:tcW w:w="1440" w:type="dxa"/>
             <w:tcBorders>
               <w:top w:val="none" w:sz="0" w:space="0" w:color="auto"/>
               <w:left w:val="none" w:sz="0" w:space="0" w:color="auto"/>
@@ -865,7 +865,7 @@
         </w:tc>
         <w:tc>
           <w:tcPr>
-            <w:tcW w:w="1417" w:type="dxa"/>
+            <w:tcW w:w="1440" w:type="dxa"/>
             <w:tcBorders>
               <w:top w:val="none" w:sz="0" w:space="0" w:color="auto"/>
               <w:left w:val="none" w:sz="0" w:space="0" w:color="auto"/>
@@ -903,7 +903,7 @@
         </w:trPr>
         <w:tc>
           <w:tcPr>
-            <w:tcW w:w="5669" w:type="dxa"/>
+            <w:tcW w:w="6048" w:type="dxa"/>
             <w:tcBorders>
               <w:top w:val="none" w:sz="0" w:space="0" w:color="auto"/>
               <w:left w:val="none" w:sz="0" w:space="0" w:color="auto"/>
@@ -952,7 +952,7 @@
         </w:tc>
         <w:tc>
           <w:tcPr>
-            <w:tcW w:w="1134" w:type="dxa"/>
+            <w:tcW w:w="1152" w:type="dxa"/>
             <w:tcBorders>
               <w:top w:val="none" w:sz="0" w:space="0" w:color="auto"/>
               <w:left w:val="none" w:sz="0" w:space="0" w:color="auto"/>
@@ -985,7 +985,7 @@
         </w:tc>
         <w:tc>
           <w:tcPr>
-            <w:tcW w:w="1417" w:type="dxa"/>
+            <w:tcW w:w="1440" w:type="dxa"/>
             <w:tcBorders>
               <w:top w:val="none" w:sz="0" w:space="0" w:color="auto"/>
               <w:left w:val="none" w:sz="0" w:space="0" w:color="auto"/>
@@ -1018,7 +1018,7 @@
         </w:tc>
         <w:tc>
           <w:tcPr>
-            <w:tcW w:w="1417" w:type="dxa"/>
+            <w:tcW w:w="1440" w:type="dxa"/>
             <w:tcBorders>
               <w:top w:val="none" w:sz="0" w:space="0" w:color="auto"/>
               <w:left w:val="none" w:sz="0" w:space="0" w:color="auto"/>
@@ -1056,7 +1056,7 @@
         </w:trPr>
         <w:tc>
           <w:tcPr>
-            <w:tcW w:w="5669" w:type="dxa"/>
+            <w:tcW w:w="6048" w:type="dxa"/>
             <w:tcBorders>
               <w:top w:val="none" w:sz="0" w:space="0" w:color="auto"/>
               <w:left w:val="none" w:sz="0" w:space="0" w:color="auto"/>
@@ -1105,7 +1105,7 @@
         </w:tc>
         <w:tc>
           <w:tcPr>
-            <w:tcW w:w="1134" w:type="dxa"/>
+            <w:tcW w:w="1152" w:type="dxa"/>
             <w:tcBorders>
               <w:top w:val="none" w:sz="0" w:space="0" w:color="auto"/>
               <w:left w:val="none" w:sz="0" w:space="0" w:color="auto"/>
@@ -1138,7 +1138,7 @@
         </w:tc>
         <w:tc>
           <w:tcPr>
-            <w:tcW w:w="1417" w:type="dxa"/>
+            <w:tcW w:w="1440" w:type="dxa"/>
             <w:tcBorders>
               <w:top w:val="none" w:sz="0" w:space="0" w:color="auto"/>
               <w:left w:val="none" w:sz="0" w:space="0" w:color="auto"/>
@@ -1171,7 +1171,7 @@
         </w:tc>
         <w:tc>
           <w:tcPr>
-            <w:tcW w:w="1417" w:type="dxa"/>
+            <w:tcW w:w="1440" w:type="dxa"/>
             <w:tcBorders>
               <w:top w:val="none" w:sz="0" w:space="0" w:color="auto"/>
               <w:left w:val="none" w:sz="0" w:space="0" w:color="auto"/>
@@ -1209,7 +1209,7 @@
         </w:trPr>
         <w:tc>
           <w:tcPr>
-            <w:tcW w:w="5669" w:type="dxa"/>
+            <w:tcW w:w="6048" w:type="dxa"/>
             <w:tcBorders>
               <w:top w:val="none" w:sz="0" w:space="0" w:color="auto"/>
               <w:left w:val="none" w:sz="0" w:space="0" w:color="auto"/>
@@ -1258,7 +1258,7 @@
         </w:tc>
         <w:tc>
           <w:tcPr>
-            <w:tcW w:w="1134" w:type="dxa"/>
+            <w:tcW w:w="1152" w:type="dxa"/>
             <w:tcBorders>
               <w:top w:val="none" w:sz="0" w:space="0" w:color="auto"/>
               <w:left w:val="none" w:sz="0" w:space="0" w:color="auto"/>
@@ -1291,7 +1291,7 @@
         </w:tc>
         <w:tc>
           <w:tcPr>
-            <w:tcW w:w="1417" w:type="dxa"/>
+            <w:tcW w:w="1440" w:type="dxa"/>
             <w:tcBorders>
               <w:top w:val="none" w:sz="0" w:space="0" w:color="auto"/>
               <w:left w:val="none" w:sz="0" w:space="0" w:color="auto"/>
@@ -1324,7 +1324,7 @@
         </w:tc>
         <w:tc>
           <w:tcPr>
-            <w:tcW w:w="1417" w:type="dxa"/>
+            <w:tcW w:w="1440" w:type="dxa"/>
             <w:tcBorders>
               <w:top w:val="none" w:sz="0" w:space="0" w:color="auto"/>
               <w:left w:val="none" w:sz="0" w:space="0" w:color="auto"/>
@@ -1362,7 +1362,7 @@
         </w:trPr>
         <w:tc>
           <w:tcPr>
-            <w:tcW w:w="5669" w:type="dxa"/>
+            <w:tcW w:w="6048" w:type="dxa"/>
             <w:tcBorders>
               <w:top w:val="none" w:sz="0" w:space="0" w:color="auto"/>
               <w:left w:val="none" w:sz="0" w:space="0" w:color="auto"/>
@@ -1411,7 +1411,7 @@
         </w:tc>
         <w:tc>
           <w:tcPr>
-            <w:tcW w:w="1134" w:type="dxa"/>
+            <w:tcW w:w="1152" w:type="dxa"/>
             <w:tcBorders>
               <w:top w:val="none" w:sz="0" w:space="0" w:color="auto"/>
               <w:left w:val="none" w:sz="0" w:space="0" w:color="auto"/>
@@ -1444,7 +1444,7 @@
         </w:tc>
         <w:tc>
           <w:tcPr>
-            <w:tcW w:w="1417" w:type="dxa"/>
+            <w:tcW w:w="1440" w:type="dxa"/>
             <w:tcBorders>
               <w:top w:val="none" w:sz="0" w:space="0" w:color="auto"/>
               <w:left w:val="none" w:sz="0" w:space="0" w:color="auto"/>
@@ -1477,7 +1477,7 @@
         </w:tc>
         <w:tc>
           <w:tcPr>
-            <w:tcW w:w="1417" w:type="dxa"/>
+            <w:tcW w:w="1440" w:type="dxa"/>
             <w:tcBorders>
               <w:top w:val="none" w:sz="0" w:space="0" w:color="auto"/>
               <w:left w:val="none" w:sz="0" w:space="0" w:color="auto"/>
@@ -1524,7 +1524,7 @@
     </w:p>
     <w:tbl>
       <w:tblPr>
-        <w:tblW w:w="9638" w:type="dxa"/>
+        <w:tblW w:w="10080" w:type="dxa"/>
         <w:tblBorders>
           <w:top w:val="none" w:sz="0" w:space="0" w:color="auto"/>
           <w:left w:val="none" w:sz="0" w:space="0" w:color="auto"/>
@@ -1542,13 +1542,13 @@
         </w:tblCellMar>
       </w:tblPr>
       <w:tblGrid>
-        <w:gridCol w:w="4994"/>
-        <w:gridCol w:w="4644"/>
+        <w:gridCol w:w="5446"/>
+        <w:gridCol w:w="4634"/>
       </w:tblGrid>
       <w:tr>
         <w:tc>
           <w:tcPr>
-            <w:tcW w:w="4994" w:type="dxa"/>
+            <w:tcW w:w="5446" w:type="dxa"/>
           </w:tcPr>
           <w:p>
             <w:pPr>
@@ -1565,11 +1565,11 @@
         </w:tc>
         <w:tc>
           <w:tcPr>
-            <w:tcW w:w="4644" w:type="dxa"/>
+            <w:tcW w:w="4634" w:type="dxa"/>
           </w:tcPr>
           <w:tbl>
             <w:tblPr>
-              <w:tblW w:w="3969" w:type="dxa"/>
+              <w:tblW w:w="3960" w:type="dxa"/>
               <w:tblBorders>
                 <w:top w:val="none" w:sz="0" w:space="0" w:color="auto"/>
                 <w:left w:val="none" w:sz="0" w:space="0" w:color="auto"/>
@@ -1588,7 +1588,7 @@
             </w:tblPr>
             <w:tblGrid>
               <w:gridCol w:w="977"/>
-              <w:gridCol w:w="1885"/>
+              <w:gridCol w:w="1876"/>
               <w:gridCol w:w="1107"/>
             </w:tblGrid>
             <w:tr>
@@ -1614,7 +1614,7 @@
               </w:tc>
               <w:tc>
                 <w:tcPr>
-                  <w:tcW w:w="1885" w:type="dxa"/>
+                  <w:tcW w:w="1876" w:type="dxa"/>
                 </w:tcPr>
                 <w:p>
                   <w:pPr>
@@ -1666,7 +1666,7 @@
           </w:p>
           <w:tbl>
             <w:tblPr>
-              <w:tblW w:w="3969" w:type="dxa"/>
+              <w:tblW w:w="3960" w:type="dxa"/>
               <w:tblBorders>
                 <w:top w:val="none" w:sz="0" w:space="0" w:color="auto"/>
                 <w:left w:val="none" w:sz="0" w:space="0" w:color="auto"/>
@@ -1685,8 +1685,8 @@
             </w:tblPr>
             <w:tblGrid>
               <w:gridCol w:w="1405"/>
-              <w:gridCol w:w="1564"/>
-              <w:gridCol w:w="1000"/>
+              <w:gridCol w:w="1556"/>
+              <w:gridCol w:w="999"/>
             </w:tblGrid>
             <w:tr>
               <w:tc>
@@ -1711,7 +1711,7 @@
               </w:tc>
               <w:tc>
                 <w:tcPr>
-                  <w:tcW w:w="1564" w:type="dxa"/>
+                  <w:tcW w:w="1556" w:type="dxa"/>
                 </w:tcPr>
                 <w:p>
                   <w:pPr>
@@ -1728,7 +1728,7 @@
               </w:tc>
               <w:tc>
                 <w:tcPr>
-                  <w:tcW w:w="1000" w:type="dxa"/>
+                  <w:tcW w:w="999" w:type="dxa"/>
                 </w:tcPr>
                 <w:p>
                   <w:pPr>
@@ -1775,7 +1775,7 @@
           </w:p>
           <w:tbl>
             <w:tblPr>
-              <w:tblW w:w="3969" w:type="dxa"/>
+              <w:tblW w:w="3960" w:type="dxa"/>
               <w:tblBorders>
                 <w:top w:val="single" w:sz="8" w:space="0" w:color="0f172a"/>
                 <w:left w:val="none" w:sz="0" w:space="0" w:color="auto"/>
@@ -1792,7 +1792,7 @@
             </w:tblPr>
             <w:tblGrid>
               <w:gridCol w:w="1325"/>
-              <w:gridCol w:w="1140"/>
+              <w:gridCol w:w="1131"/>
               <w:gridCol w:w="1504"/>
             </w:tblGrid>
             <w:tr>
@@ -1832,7 +1832,7 @@
               </w:tc>
               <w:tc>
                 <w:tcPr>
-                  <w:tcW w:w="1140" w:type="dxa"/>
+                  <w:tcW w:w="1131" w:type="dxa"/>
                   <w:tcMar>
                     <w:top w:w="140" w:type="dxa"/>
                     <w:left w:w="0" w:type="dxa"/>
@@ -1919,8 +1919,8 @@
     </w:p>
     <w:sectPr>
       <w:footerReference w:type="default" r:id="rId1"/>
-      <w:pgSz w:w="11906" w:h="16838" w:orient="portrait"/>
-      <w:pgMar w:top="1134" w:right="1134" w:bottom="1134" w:left="1134" w:header="1134" w:footer="1134" w:gutter="0"/>
+      <w:pgSz w:w="12240" w:h="15840" w:orient="portrait"/>
+      <w:pgMar w:top="1080" w:right="1080" w:bottom="1080" w:left="1080" w:header="1080" w:footer="1080" w:gutter="0"/>
     </w:sectPr>
   </w:body>
 </w:document>
@@ -1942,7 +1942,7 @@
   </w:p>
   <w:tbl>
     <w:tblPr>
-      <w:tblW w:w="9638" w:type="dxa"/>
+      <w:tblW w:w="10080" w:type="dxa"/>
       <w:tblBorders>
         <w:top w:val="none" w:sz="0" w:space="0" w:color="auto"/>
         <w:left w:val="none" w:sz="0" w:space="0" w:color="auto"/>
@@ -1960,12 +1960,12 @@
       </w:tblCellMar>
     </w:tblPr>
     <w:tblGrid>
-      <w:gridCol w:w="9638"/>
+      <w:gridCol w:w="10080"/>
     </w:tblGrid>
     <w:tr>
       <w:tc>
         <w:tcPr>
-          <w:tcW w:w="9638" w:type="dxa"/>
+          <w:tcW w:w="10080" w:type="dxa"/>
           <w:tcBorders>
             <w:top w:val="single" w:sz="4" w:space="0" w:color="e2e8f0"/>
             <w:left w:val="none" w:sz="0" w:space="0" w:color="auto"/>
@@ -1981,7 +1981,7 @@
         </w:tcPr>
         <w:tbl>
           <w:tblPr>
-            <w:tblW w:w="9638" w:type="dxa"/>
+            <w:tblW w:w="10080" w:type="dxa"/>
             <w:tblBorders>
               <w:top w:val="none" w:sz="0" w:space="0" w:color="auto"/>
               <w:left w:val="none" w:sz="0" w:space="0" w:color="auto"/>
@@ -1999,14 +1999,14 @@
             </w:tblCellMar>
           </w:tblPr>
           <w:tblGrid>
-            <w:gridCol w:w="8129"/>
+            <w:gridCol w:w="8571"/>
             <w:gridCol w:w="120"/>
             <w:gridCol w:w="1389"/>
           </w:tblGrid>
           <w:tr>
             <w:tc>
               <w:tcPr>
-                <w:tcW w:w="8129" w:type="dxa"/>
+                <w:tcW w:w="8571" w:type="dxa"/>
               </w:tcPr>
               <w:p>
                 <w:pPr>

</xml_diff>